<commit_message>
perbaikan simple sampai no 5
1. Tanggal ttd
2. hapus pengajuan lembur yang tidak lembur di PRESENSI LEMBUR
3. Pengajuan jam lembur tambahkan 1 kolom di PRSENSI LEMBUR
4. Presensi Lembur di buat landscape
5. jam pembulatan ke bawah
6. di approval Kabag, tambah edit jam tanpa harus di tolak
</commit_message>
<xml_diff>
--- a/public/document/template_spkl.docx
+++ b/public/document/template_spkl.docx
@@ -753,14 +753,14 @@
         <w:tblLook w:val="04A0" w:firstRow="1" w:lastRow="0" w:firstColumn="1" w:lastColumn="0" w:noHBand="0" w:noVBand="1"/>
       </w:tblPr>
       <w:tblGrid>
-        <w:gridCol w:w="3171"/>
-        <w:gridCol w:w="3171"/>
-        <w:gridCol w:w="3172"/>
+        <w:gridCol w:w="7513"/>
+        <w:gridCol w:w="1985"/>
+        <w:gridCol w:w="4252"/>
       </w:tblGrid>
       <w:tr>
         <w:tc>
           <w:tcPr>
-            <w:tcW w:w="3171" w:type="dxa"/>
+            <w:tcW w:w="7513" w:type="dxa"/>
           </w:tcPr>
           <w:p>
             <w:pPr>
@@ -774,7 +774,7 @@
         </w:tc>
         <w:tc>
           <w:tcPr>
-            <w:tcW w:w="3171" w:type="dxa"/>
+            <w:tcW w:w="1985" w:type="dxa"/>
           </w:tcPr>
           <w:p>
             <w:pPr>
@@ -788,7 +788,7 @@
         </w:tc>
         <w:tc>
           <w:tcPr>
-            <w:tcW w:w="3172" w:type="dxa"/>
+            <w:tcW w:w="4252" w:type="dxa"/>
           </w:tcPr>
           <w:p>
             <w:pPr>
@@ -811,11 +811,10 @@
       <w:tr>
         <w:tc>
           <w:tcPr>
-            <w:tcW w:w="3171" w:type="dxa"/>
+            <w:tcW w:w="7513" w:type="dxa"/>
           </w:tcPr>
           <w:p>
             <w:pPr>
-              <w:jc w:val="both"/>
               <w:rPr>
                 <w:rFonts w:ascii="Arial" w:hAnsi="Arial" w:cs="Arial"/>
                 <w:lang w:val="sv-SE"/>
@@ -825,7 +824,7 @@
         </w:tc>
         <w:tc>
           <w:tcPr>
-            <w:tcW w:w="3171" w:type="dxa"/>
+            <w:tcW w:w="1985" w:type="dxa"/>
           </w:tcPr>
           <w:p>
             <w:pPr>
@@ -839,7 +838,7 @@
         </w:tc>
         <w:tc>
           <w:tcPr>
-            <w:tcW w:w="3172" w:type="dxa"/>
+            <w:tcW w:w="4252" w:type="dxa"/>
           </w:tcPr>
           <w:p>
             <w:pPr>
@@ -876,7 +875,7 @@
       <w:tr>
         <w:tc>
           <w:tcPr>
-            <w:tcW w:w="3171" w:type="dxa"/>
+            <w:tcW w:w="7513" w:type="dxa"/>
           </w:tcPr>
           <w:p>
             <w:pPr>
@@ -890,7 +889,7 @@
         </w:tc>
         <w:tc>
           <w:tcPr>
-            <w:tcW w:w="3171" w:type="dxa"/>
+            <w:tcW w:w="1985" w:type="dxa"/>
           </w:tcPr>
           <w:p>
             <w:pPr>
@@ -904,7 +903,7 @@
         </w:tc>
         <w:tc>
           <w:tcPr>
-            <w:tcW w:w="3172" w:type="dxa"/>
+            <w:tcW w:w="4252" w:type="dxa"/>
           </w:tcPr>
           <w:p>
             <w:pPr>
@@ -956,7 +955,7 @@
       <w:tr>
         <w:tc>
           <w:tcPr>
-            <w:tcW w:w="3171" w:type="dxa"/>
+            <w:tcW w:w="7513" w:type="dxa"/>
           </w:tcPr>
           <w:p>
             <w:pPr>
@@ -970,7 +969,7 @@
         </w:tc>
         <w:tc>
           <w:tcPr>
-            <w:tcW w:w="3171" w:type="dxa"/>
+            <w:tcW w:w="1985" w:type="dxa"/>
           </w:tcPr>
           <w:p>
             <w:pPr>
@@ -984,7 +983,7 @@
         </w:tc>
         <w:tc>
           <w:tcPr>
-            <w:tcW w:w="3172" w:type="dxa"/>
+            <w:tcW w:w="4252" w:type="dxa"/>
           </w:tcPr>
           <w:p>
             <w:pPr>
@@ -1031,8 +1030,8 @@
       </w:pPr>
     </w:p>
     <w:sectPr>
-      <w:pgSz w:w="11906" w:h="16838"/>
-      <w:pgMar w:top="851" w:right="1191" w:bottom="1440" w:left="1191" w:header="709" w:footer="709" w:gutter="0"/>
+      <w:pgSz w:w="16838" w:h="11906" w:orient="landscape"/>
+      <w:pgMar w:top="1191" w:right="851" w:bottom="1191" w:left="1440" w:header="709" w:footer="709" w:gutter="0"/>
       <w:cols w:space="708"/>
       <w:titlePg/>
       <w:docGrid w:linePitch="360"/>

</xml_diff>